<commit_message>
Rapports : auteurs, registre academique, typographie
- Page de titre des deux rapports : Edouard LOUAMOU, Isaac KOUMOUS,
  Jeffrey TANDJEU, Kelian SUAMI.

- Registre : suppression des formulations evaluatives ou journalistiques
  ("sans appel", "sans ambiguite", "s'effondre", "malhonnete", "troquer une
  exigence contre un agrement", "bat les GANs"), des antitheses en "ce n'est
  pas X mais Y" et des tournures clivees, remplacees par des enonces directs.

- Typographie : cadratins convertis dans les rapports et les fichiers
  markdown du depot.

- Correction de trois paragraphes casses par la conversion automatique des
  tirets : lorsque les deux tirets d'une incise se trouvaient dans des
  fragments XML distincts, l'appariement en parentheses traversait une fin de
  phrase et rendait le texte agrammatical. Deux occurrences dans l'etat de
  l'art (InterFaceGAN, LPIPS), une dans le rapport d'experiences.
</commit_message>
<xml_diff>
--- a/rapport/Etat_de_l_art.docx
+++ b/rapport/Etat_de_l_art.docx
@@ -70,6 +70,35 @@
           <w:szCs w:val="24"/>
         </w:rPr>
         <w:t xml:space="preserve">Techniques de génération, contrôle conditionnel et métriques d'évaluation</w:t>
+      </w:r>
+    </w:p>
+    <w:p>
+      <w:pPr>
+        <w:spacing w:after="60" w:before="200"/>
+        <w:jc w:val="center"/>
+      </w:pPr>
+      <w:r>
+        <w:rPr>
+          <w:rFonts w:ascii="Calibri" w:cs="Calibri" w:eastAsia="Calibri" w:hAnsi="Calibri"/>
+          <w:color w:val="666666"/>
+          <w:sz w:val="20"/>
+          <w:szCs w:val="20"/>
+        </w:rPr>
+        <w:t xml:space="preserve">Travail réalisé par</w:t>
+      </w:r>
+    </w:p>
+    <w:p>
+      <w:pPr>
+        <w:spacing w:after="200"/>
+        <w:jc w:val="center"/>
+      </w:pPr>
+      <w:r>
+        <w:rPr>
+          <w:rFonts w:ascii="Calibri" w:cs="Calibri" w:eastAsia="Calibri" w:hAnsi="Calibri"/>
+          <w:sz w:val="22"/>
+          <w:szCs w:val="22"/>
+        </w:rPr>
+        <w:t xml:space="preserve">Edouard LOUAMOU · Isaac KOUMOUS · Jeffrey TANDJEU · Kelian SUAMI</w:t>
       </w:r>
     </w:p>
     <w:p>
@@ -614,7 +643,7 @@
           <w:sz w:val="22"/>
           <w:szCs w:val="22"/>
         </w:rPr>
-        <w:t xml:space="preserve"> et on débruite itérativement. Cette perte de régression, sans dynamique adversaire, explique la stabilité remarquable de l'entraînement : pas de mode collapse, convergence monotone, hyperparamètres peu sensibles. Improved DDPM [11] apporte le programme de bruit en cosinus (qui détruit l'information plus graduellement que le programme linéaire, bénéfique en basse résolution) et l'apprentissage des variances ; Dhariwal &amp; Nichol [12] démontrent, avec une architecture UNet optimisée et le guidage par classifieur, que la diffusion bat les GANs en qualité d'image sur ImageNet, résultat charnière qui a fait basculer le domaine.</w:t>
+        <w:t xml:space="preserve"> et on débruite itérativement. Cette perte de régression, sans dynamique adversaire, explique la stabilité remarquable de l'entraînement : pas de mode collapse, convergence monotone, hyperparamètres peu sensibles. Improved DDPM [11] apporte le programme de bruit en cosinus (qui détruit l'information plus graduellement que le programme linéaire, bénéfique en basse résolution) et l'apprentissage des variances ; Dhariwal &amp; Nichol [12] démontrent, avec une architecture UNet optimisée et le guidage par classifieur, que la diffusion surpasse les GANs en qualité d'image sur ImageNet, résultat charnière qui a fait basculer le domaine.</w:t>
       </w:r>
     </w:p>
     <w:p>
@@ -1637,7 +1666,7 @@
           <w:sz w:val="22"/>
           <w:szCs w:val="22"/>
         </w:rPr>
-        <w:t xml:space="preserve">L'approche duale exploite un générateur inconditionnel déjà entraîné. InfoGAN [16] force, dès l'entraînement, un sous-ensemble du code latent à être informatif (maximisation d'information mutuelle), faisant émerger des facteurs interprétables sans supervision. Avec StyleGAN, la désintrication devient exploitable a posteriori : InterFaceGAN [17] entraîne un simple SVM dans l'espace latent pour séparer, par exemple, les visages jeunes des visages âgés (la normale de l'hyperplan est alors une direction d'édition de l'âge ; GANSpace [18] découvre des directions par simple ACP des latents. Ces méthodes produisent des éditions spectaculaires mais souffrent de l'intrication résiduelle : la direction « âge » modifie souvent lunettes ou expression, et le contrôle précis d'attributs multiples exige des orthogonalisations délicates. Pour un contrôle démographique exact) l'objet du projet, le conditionnement explicite pendant l'entraînement reste plus fiable ; la désintrication demeure en revanche la référence pour l'édition de visages réels existants.</w:t>
+        <w:t xml:space="preserve">L'approche duale exploite un générateur inconditionnel déjà entraîné. InfoGAN [16] force, dès l'entraînement, un sous-ensemble du code latent à être informatif (maximisation d'information mutuelle), faisant émerger des facteurs interprétables sans supervision. Avec StyleGAN, la désintrication devient exploitable a posteriori : InterFaceGAN [17] entraîne un simple SVM dans l'espace latent pour séparer, par exemple, les visages jeunes des visages âgés (la normale de l'hyperplan est alors une direction d'édition de l'âge) ; GANSpace [18] découvre des directions par simple ACP des latents. Ces méthodes produisent des éditions visuellement convaincantes mais souffrent de l'intrication résiduelle : la direction « âge » modifie souvent lunettes ou expression, et le contrôle précis d'attributs multiples exige des orthogonalisations délicates. Pour un contrôle démographique exact, objet du projet, le conditionnement explicite pendant l'entraînement reste plus fiable ; la désintrication demeure en revanche la référence pour l'édition de visages réels existants.</w:t>
       </w:r>
     </w:p>
     <w:p>
@@ -1797,7 +1826,7 @@
           <w:sz w:val="22"/>
           <w:szCs w:val="22"/>
         </w:rPr>
-        <w:t xml:space="preserve">LPIPS [21] mesure la distance entre deux images dans l'espace des activations d'un réseau profond, calibré sur des jugements humains (bien plus fidèle à la perception que le PSNR ou le SSIM. Au-delà de son usage en similarité, nous l'employons comme mesure de diversité intra-condition : pour des attributs fixés, on génère N visages et on calcule le LPIPS moyen entre paires. Une valeur élevée indique que le modèle produit des identités variées pour une même condition ; une valeur proche de zéro trahit un mode collapse conditionnel) pathologie typique des cGANs que cette métrique rend visible et que la comparaison DDPM/cGAN de notre démonstrateur illustre. Precision/Recall pour modèles génératifs [22] complète ce tableau en séparant explicitement réalisme (precision) et couverture (recall).</w:t>
+        <w:t xml:space="preserve">LPIPS [21] mesure la distance entre deux images dans l'espace des activations d'un réseau profond, calibré sur des jugements humains (bien plus fidèle à la perception que le PSNR ou le SSIM). Au-delà de son usage en similarité, nous l'employons comme mesure de diversité intra-condition : pour des attributs fixés, on génère N visages et on calcule le LPIPS moyen entre paires. Une valeur élevée indique que le modèle produit des identités variées pour une même condition ; une valeur proche de zéro trahit un mode collapse conditionnel, pathologie typique des cGANs que cette métrique rend visible et que la comparaison DDPM/cGAN de notre démonstrateur illustre. Precision/Recall pour modèles génératifs [22] complète ce tableau en séparant explicitement réalisme (precision) et couverture (recall).</w:t>
       </w:r>
     </w:p>
     <w:p>

</xml_diff>